<commit_message>
Mecánica de ataque, niveles procedurales y nuevas mecánicas
- Cambio 1: Ahora se pueden subir las cajas a las plataformas
- Cambio 2: Desde el nivel 5, los niveles son generados proceduralmente
- Cambio 3: Ahora hay un sistema de vidas. Cada obstáculo o enemigo quita 1 vida. A las 0 vidas, el jugador pierde.
</commit_message>
<xml_diff>
--- a/ESCARABOX - GDD.docx
+++ b/ESCARABOX - GDD.docx
@@ -482,7 +482,7 @@
           <w:szCs w:val="24"/>
           <w:rtl w:val="0"/>
         </w:rPr>
-        <w:t xml:space="preserve">: El jugador tendrá una sola vida. Si colisiona con algún obstáculo, esta se consumirá y perderá el nivel.</w:t>
+        <w:t xml:space="preserve">: El jugador tiene 3 vidas. Cada contacto con un peligro (puas, laser o enemigo centinela) le quita una vida y le otorga 1,2 segundos de invulnerabilidad parpadeante. Al llegar a 0 vidas, pierde el nivel.</w:t>
       </w:r>
     </w:p>
     <w:p>
@@ -530,6 +530,36 @@
           <w:rtl w:val="0"/>
         </w:rPr>
         <w:t xml:space="preserve"> Por cada nivel, habrá una serie de obstáculos (Púas, láseres) que podrán eliminar al jugador al contacto de ellos. Estos estarán posicionados en lugares estratégicos para que este mismo tenga que maniobrar su forma de llevar las cajas.</w:t>
+      </w:r>
+    </w:p>
+    <w:p>
+      <w:pPr>
+        <w:spacing w:line="480" w:lineRule="auto"/>
+      </w:pPr>
+      <w:r>
+        <w:rPr>
+          <w:rFonts w:ascii="Lucida Sans" w:cs="Lucida Sans" w:eastAsia="Lucida Sans" w:hAnsi="Lucida Sans"/>
+          <w:sz w:val="24"/>
+          <w:szCs w:val="24"/>
+          <w:rtl w:val="0"/>
+          <w:b w:val="1"/>
+          <w:bCs w:val="1"/>
+        </w:rPr>
+        <w:t xml:space="preserve">Enemigos y ataque:</w:t>
+      </w:r>
+    </w:p>
+    <w:p>
+      <w:pPr>
+        <w:spacing w:line="480" w:lineRule="auto"/>
+      </w:pPr>
+      <w:r>
+        <w:rPr>
+          <w:rFonts w:ascii="Lucida Sans" w:cs="Lucida Sans" w:eastAsia="Lucida Sans" w:hAnsi="Lucida Sans"/>
+          <w:sz w:val="24"/>
+          <w:szCs w:val="24"/>
+          <w:rtl w:val="0"/>
+        </w:rPr>
+        <w:t xml:space="preserve">Ademas de las pusas y los lasers, cada nivel incorpora centinelas que patrullan un tramo fijo de plataforma. El jugador puede destruirlos con un ataque cuerpo a cuerpo que se ejecuta con la tecla X: un tajo corto hacia el lado al que mira, con una recarga breve. Los centinelas no empujan las cajas, de modo que nunca impiden resolver un nivel: solo dificultan el trayecto.</w:t>
       </w:r>
     </w:p>
     <w:p>
@@ -851,6 +881,20 @@
           <w:rtl w:val="0"/>
         </w:rPr>
         <w:t xml:space="preserve">Barra espaciadora -&gt; Salto</w:t>
+      </w:r>
+    </w:p>
+    <w:p>
+      <w:pPr>
+        <w:spacing w:line="480" w:lineRule="auto"/>
+      </w:pPr>
+      <w:r>
+        <w:rPr>
+          <w:rFonts w:ascii="Lucida Sans" w:cs="Lucida Sans" w:eastAsia="Lucida Sans" w:hAnsi="Lucida Sans"/>
+          <w:sz w:val="24"/>
+          <w:szCs w:val="24"/>
+          <w:rtl w:val="0"/>
+        </w:rPr>
+        <w:t xml:space="preserve">Tecla X -&gt; Ataque cuerpo a cuerpo</w:t>
       </w:r>
     </w:p>
     <w:p>

</xml_diff>